<commit_message>
Revise ISAM abstract per Niti's review
- Drop "MakerBot" (trademark of the MakerBot 3D-printer company); rename the
  assistant to "the MakerLab Assistant" and the app to "MakerLab Tools", both
  matching the live UI. New title: "The MakerLab Assistant: Conversational AI
  for Makerspace Operations".
- §1: "a first inventory app" -> "the first inventory app".
- Fig 2: replace the Trotec laser example with a 3D printer (Bambu Lab
  X1-Carbon) first-print / bed-adhesion exchange; update caption and §3.1.

Co-Authored-By: Claude Opus 4.8 (1M context) <noreply@anthropic.com>
</commit_message>
<xml_diff>
--- a/docs/isam-2026-demo/abstract.docx
+++ b/docs/isam-2026-demo/abstract.docx
@@ -7,7 +7,7 @@
         <w:pStyle w:val="Title"/>
       </w:pPr>
       <w:r>
-        <w:t xml:space="preserve">MakerBot — ISAM 2026 Demo Extended Abstract</w:t>
+        <w:t xml:space="preserve">The MakerLab Assistant — ISAM 2026 Demo Extended Abstract</w:t>
       </w:r>
     </w:p>
     <w:p>
@@ -18,13 +18,13 @@
         <w:t xml:space="preserve">International Symposium on Academic Makerspaces — ISAM 2026</w:t>
       </w:r>
     </w:p>
-    <w:bookmarkStart w:id="9" w:name="Xc2a9df86ebc4a316fe091436edf2ccddc5c5bee"/>
+    <w:bookmarkStart w:id="9" w:name="Xb3253d97ddb1131835ef8d657b693dcda864988"/>
     <w:p>
       <w:pPr>
         <w:pStyle w:val="Heading1"/>
       </w:pPr>
       <w:r>
-        <w:t xml:space="preserve">MakerBot: An AI Assistant for Makerspace Operations</w:t>
+        <w:t xml:space="preserve">The MakerLab Assistant: Conversational AI for Makerspace Operations</w:t>
       </w:r>
     </w:p>
     <w:p>
@@ -153,7 +153,7 @@
         <w:t xml:space="preserve"> </w:t>
       </w:r>
       <w:r>
-        <w:t xml:space="preserve">workflow planning. We demonstrate</w:t>
+        <w:t xml:space="preserve">workflow planning. We demonstrate the</w:t>
       </w:r>
       <w:r>
         <w:t xml:space="preserve"> </w:t>
@@ -163,10 +163,16 @@
           <w:b/>
           <w:bCs/>
         </w:rPr>
-        <w:t xml:space="preserve">MakerBot</w:t>
-      </w:r>
-      <w:r>
-        <w:t xml:space="preserve">, the conversational assistant in the</w:t>
+        <w:t xml:space="preserve">MakerLab Assistant</w:t>
+      </w:r>
+      <w:r>
+        <w:t xml:space="preserve">, a conversational AI layered over</w:t>
+      </w:r>
+      <w:r>
+        <w:t xml:space="preserve"> </w:t>
+      </w:r>
+      <w:r>
+        <w:t xml:space="preserve">a structured operational database (hosted in Notion) within the</w:t>
       </w:r>
       <w:r>
         <w:t xml:space="preserve"> </w:t>
@@ -176,25 +182,25 @@
           <w:i/>
           <w:iCs/>
         </w:rPr>
-        <w:t xml:space="preserve">MakerLab AI Assistant</w:t>
-      </w:r>
-      <w:r>
-        <w:t xml:space="preserve"> </w:t>
-      </w:r>
-      <w:r>
-        <w:t xml:space="preserve">app, which layers an AI interface over a structured operational</w:t>
-      </w:r>
-      <w:r>
-        <w:t xml:space="preserve"> </w:t>
-      </w:r>
-      <w:r>
-        <w:t xml:space="preserve">database (hosted in Notion) so students can, in plain language and in any language, find the right</w:t>
-      </w:r>
-      <w:r>
-        <w:t xml:space="preserve"> </w:t>
-      </w:r>
-      <w:r>
-        <w:t xml:space="preserve">tool, follow manual-grounded setup and troubleshooting, and scope multi-machine projects. The same</w:t>
+        <w:t xml:space="preserve">MakerLab Tools</w:t>
+      </w:r>
+      <w:r>
+        <w:t xml:space="preserve"> </w:t>
+      </w:r>
+      <w:r>
+        <w:t xml:space="preserve">app, so</w:t>
+      </w:r>
+      <w:r>
+        <w:t xml:space="preserve"> </w:t>
+      </w:r>
+      <w:r>
+        <w:t xml:space="preserve">students can, in plain language and in any language, find the right tool, follow manual-grounded</w:t>
+      </w:r>
+      <w:r>
+        <w:t xml:space="preserve"> </w:t>
+      </w:r>
+      <w:r>
+        <w:t xml:space="preserve">setup and troubleshooting, and scope multi-machine projects. The same</w:t>
       </w:r>
       <w:r>
         <w:t xml:space="preserve"> </w:t>
@@ -269,7 +275,7 @@
         <w:pStyle w:val="FirstParagraph"/>
       </w:pPr>
       <w:r>
-        <w:t xml:space="preserve">The project began on the floor of the Cornell Tech MakerLAB. An intern (a co-author) built a</w:t>
+        <w:t xml:space="preserve">The project began on the floor of the Cornell Tech MakerLAB. An intern (a co-author) built the</w:t>
       </w:r>
       <w:r>
         <w:t xml:space="preserve"> </w:t>
@@ -521,23 +527,17 @@
         <w:pStyle w:val="FirstParagraph"/>
       </w:pPr>
       <w:r>
-        <w:t xml:space="preserve">The</w:t>
-      </w:r>
-      <w:r>
-        <w:t xml:space="preserve"> </w:t>
-      </w:r>
-      <w:r>
         <w:rPr>
           <w:i/>
           <w:iCs/>
         </w:rPr>
-        <w:t xml:space="preserve">MakerLab AI Assistant</w:t>
-      </w:r>
-      <w:r>
-        <w:t xml:space="preserve"> </w:t>
-      </w:r>
-      <w:r>
-        <w:t xml:space="preserve">app treats the lab’s operational knowledge as structured,</w:t>
+        <w:t xml:space="preserve">MakerLab Tools</w:t>
+      </w:r>
+      <w:r>
+        <w:t xml:space="preserve"> </w:t>
+      </w:r>
+      <w:r>
+        <w:t xml:space="preserve">treats the lab’s operational knowledge as structured,</w:t>
       </w:r>
       <w:r>
         <w:t xml:space="preserve"> </w:t>
@@ -629,7 +629,7 @@
           <wp:inline>
             <wp:extent cx="5334000" cy="3115204"/>
             <wp:effectExtent b="0" l="0" r="0" t="0"/>
-            <wp:docPr descr="MakerLab AI Assistant gallery" title="" id="12" name="Picture"/>
+            <wp:docPr descr="MakerLab Tools gallery" title="" id="12" name="Picture"/>
             <a:graphic>
               <a:graphicData uri="http://schemas.openxmlformats.org/drawingml/2006/picture">
                 <pic:pic>
@@ -686,7 +686,7 @@
         <w:pStyle w:val="BodyText"/>
       </w:pPr>
       <w:r>
-        <w:t xml:space="preserve">Overlaying both pages is</w:t>
+        <w:t xml:space="preserve">Overlaying both pages is the</w:t>
       </w:r>
       <w:r>
         <w:t xml:space="preserve"> </w:t>
@@ -696,16 +696,16 @@
           <w:b/>
           <w:bCs/>
         </w:rPr>
-        <w:t xml:space="preserve">MakerBot</w:t>
-      </w:r>
-      <w:r>
-        <w:t xml:space="preserve">, a conversational assistant invoked from any page</w:t>
-      </w:r>
-      <w:r>
-        <w:t xml:space="preserve"> </w:t>
-      </w:r>
-      <w:r>
-        <w:t xml:space="preserve">(Fig. 2). Rather than baking the catalog into a prompt, MakerBot reasons over it through</w:t>
+        <w:t xml:space="preserve">MakerLab Assistant</w:t>
+      </w:r>
+      <w:r>
+        <w:t xml:space="preserve">, invoked from any page</w:t>
+      </w:r>
+      <w:r>
+        <w:t xml:space="preserve"> </w:t>
+      </w:r>
+      <w:r>
+        <w:t xml:space="preserve">(Fig. 2). Rather than baking the catalog into a prompt, it reasons over it through</w:t>
       </w:r>
       <w:r>
         <w:t xml:space="preserve"> </w:t>
@@ -741,7 +741,7 @@
         <w:t xml:space="preserve"> </w:t>
       </w:r>
       <w:r>
-        <w:t xml:space="preserve">(including right-to-left Arabic and Hebrew), and MakerBot answers in the language asked. The app is</w:t>
+        <w:t xml:space="preserve">(including right-to-left Arabic and Hebrew), and the assistant answers in the language asked. The app is</w:t>
       </w:r>
       <w:r>
         <w:t xml:space="preserve"> </w:t>
@@ -772,7 +772,7 @@
           <wp:inline>
             <wp:extent cx="5334000" cy="3115204"/>
             <wp:effectExtent b="0" l="0" r="0" t="0"/>
-            <wp:docPr descr="MakerBot answering a laser-cutter question" title="" id="15" name="Picture"/>
+            <wp:docPr descr="The MakerLab Assistant answering a 3D-printer question" title="" id="15" name="Picture"/>
             <a:graphic>
               <a:graphicData uri="http://schemas.openxmlformats.org/drawingml/2006/picture">
                 <pic:pic>
@@ -815,19 +815,19 @@
         <w:pStyle w:val="ImageCaption"/>
       </w:pPr>
       <w:r>
-        <w:t xml:space="preserve">Fig. 2: A live MakerBot exchange on the Trotec Speedy 400 page. Asked about rough</w:t>
-      </w:r>
-      <w:r>
-        <w:t xml:space="preserve"> </w:t>
-      </w:r>
-      <w:r>
-        <w:t xml:space="preserve">acrylic edges and smoke, it pulls the machine’s manual and returns focusing (JobControl</w:t>
-      </w:r>
-      <w:r>
-        <w:t xml:space="preserve"> </w:t>
-      </w:r>
-      <w:r>
-        <w:t xml:space="preserve">autofocus) and exhaust guidance.</w:t>
+        <w:t xml:space="preserve">Fig. 2: A live MakerLab Assistant exchange on the Bambu Lab X1-Carbon page. A</w:t>
+      </w:r>
+      <w:r>
+        <w:t xml:space="preserve"> </w:t>
+      </w:r>
+      <w:r>
+        <w:t xml:space="preserve">first-time user asks how to get a PLA print to stick; it pulls the printer’s SOP and returns</w:t>
+      </w:r>
+      <w:r>
+        <w:t xml:space="preserve"> </w:t>
+      </w:r>
+      <w:r>
+        <w:t xml:space="preserve">a pre-print checklist (glue, build plate, bed leveling, filament profile).</w:t>
       </w:r>
     </w:p>
     <w:bookmarkEnd w:id="17"/>
@@ -881,13 +881,61 @@
         <w:pStyle w:val="FirstParagraph"/>
       </w:pPr>
       <w:r>
-        <w:t xml:space="preserve">Attendees open MakerBot on a machine page and ask operational questions in plain language. On the</w:t>
-      </w:r>
-      <w:r>
-        <w:t xml:space="preserve"> </w:t>
-      </w:r>
-      <w:r>
-        <w:t xml:space="preserve">Trotec Speedy 400 laser,</w:t>
+        <w:t xml:space="preserve">Attendees open the MakerLab Assistant on a machine page and ask operational questions in plain</w:t>
+      </w:r>
+      <w:r>
+        <w:t xml:space="preserve"> </w:t>
+      </w:r>
+      <w:r>
+        <w:t xml:space="preserve">language. On the Bambu Lab X1-Carbon, a first-timer asks how to get a PLA print to stick; the</w:t>
+      </w:r>
+      <w:r>
+        <w:t xml:space="preserve"> </w:t>
+      </w:r>
+      <w:r>
+        <w:t xml:space="preserve">assistant pulls the printer’s SOP and returns a pre-print checklist—glue, the right build</w:t>
+      </w:r>
+      <w:r>
+        <w:t xml:space="preserve"> </w:t>
+      </w:r>
+      <w:r>
+        <w:t xml:space="preserve">plate, bed leveling in Bambu Studio, and a matching filament profile (Fig. 2). The same flow</w:t>
+      </w:r>
+      <w:r>
+        <w:t xml:space="preserve"> </w:t>
+      </w:r>
+      <w:r>
+        <w:t xml:space="preserve">handles a fault on a staged sample device—photograph the error, get manual-grounded recovery</w:t>
+      </w:r>
+      <w:r>
+        <w:t xml:space="preserve"> </w:t>
+      </w:r>
+      <w:r>
+        <w:t xml:space="preserve">steps in any language, and file a repair report on the spot—so the machine stays online and</w:t>
+      </w:r>
+      <w:r>
+        <w:t xml:space="preserve"> </w:t>
+      </w:r>
+      <w:r>
+        <w:t xml:space="preserve">the incident is captured rather than lost.</w:t>
+      </w:r>
+    </w:p>
+    <w:bookmarkEnd w:id="18"/>
+    <w:bookmarkStart w:id="22" w:name="scope-a-project-across-machines."/>
+    <w:p>
+      <w:pPr>
+        <w:pStyle w:val="Heading3"/>
+      </w:pPr>
+      <w:r>
+        <w:t xml:space="preserve">3.2 Scope a project across machines.</w:t>
+      </w:r>
+    </w:p>
+    <w:p>
+      <w:pPr>
+        <w:pStyle w:val="FirstParagraph"/>
+      </w:pPr>
+      <w:r>
+        <w:t xml:space="preserve">From the gallery, a newcomer asks</w:t>
       </w:r>
       <w:r>
         <w:t xml:space="preserve"> </w:t>
@@ -897,7 +945,7 @@
           <w:i/>
           <w:iCs/>
         </w:rPr>
-        <w:t xml:space="preserve">“my acrylic edges are rough and there’s a lot of</w:t>
+        <w:t xml:space="preserve">“I want to make a wooden box for my phone with a</w:t>
       </w:r>
       <w:r>
         <w:rPr>
@@ -911,85 +959,13 @@
           <w:i/>
           <w:iCs/>
         </w:rPr>
-        <w:t xml:space="preserve">smoke—how do I focus the laser and manage the exhaust?”</w:t>
-      </w:r>
-      <w:r>
-        <w:t xml:space="preserve"> </w:t>
-      </w:r>
-      <w:r>
-        <w:t xml:space="preserve">prompts the assistant to pull</w:t>
-      </w:r>
-      <w:r>
-        <w:t xml:space="preserve"> </w:t>
-      </w:r>
-      <w:r>
-        <w:t xml:space="preserve">the machine’s manual and return concrete focusing (JobControl autofocus) and exhaust steps</w:t>
-      </w:r>
-      <w:r>
-        <w:t xml:space="preserve"> </w:t>
-      </w:r>
-      <w:r>
-        <w:t xml:space="preserve">(Fig. 2). The same flow handles a fault on a staged sample device—photograph the error,</w:t>
-      </w:r>
-      <w:r>
-        <w:t xml:space="preserve"> </w:t>
-      </w:r>
-      <w:r>
-        <w:t xml:space="preserve">get manual-grounded recovery steps in any language, and file a repair report on the spot—so the</w:t>
-      </w:r>
-      <w:r>
-        <w:t xml:space="preserve"> </w:t>
-      </w:r>
-      <w:r>
-        <w:t xml:space="preserve">machine stays online and the incident is captured rather than lost.</w:t>
-      </w:r>
-    </w:p>
-    <w:bookmarkEnd w:id="18"/>
-    <w:bookmarkStart w:id="22" w:name="scope-a-project-across-machines."/>
-    <w:p>
-      <w:pPr>
-        <w:pStyle w:val="Heading3"/>
-      </w:pPr>
-      <w:r>
-        <w:t xml:space="preserve">3.2 Scope a project across machines.</w:t>
-      </w:r>
-    </w:p>
-    <w:p>
-      <w:pPr>
-        <w:pStyle w:val="FirstParagraph"/>
-      </w:pPr>
-      <w:r>
-        <w:t xml:space="preserve">From the gallery, a newcomer asks</w:t>
-      </w:r>
-      <w:r>
-        <w:t xml:space="preserve"> </w:t>
-      </w:r>
-      <w:r>
-        <w:rPr>
-          <w:i/>
-          <w:iCs/>
-        </w:rPr>
-        <w:t xml:space="preserve">“I want to make a wooden box for my phone with a</w:t>
-      </w:r>
-      <w:r>
-        <w:rPr>
-          <w:i/>
-          <w:iCs/>
-        </w:rPr>
-        <w:t xml:space="preserve"> </w:t>
-      </w:r>
-      <w:r>
-        <w:rPr>
-          <w:i/>
-          <w:iCs/>
-        </w:rPr>
         <w:t xml:space="preserve">hinged lid—which machines and steps would I need?”</w:t>
       </w:r>
       <w:r>
         <w:t xml:space="preserve"> </w:t>
       </w:r>
       <w:r>
-        <w:t xml:space="preserve">MakerBot returns a start-to-finish,</w:t>
+        <w:t xml:space="preserve">the MakerLab Assistant returns a start-to-finish,</w:t>
       </w:r>
       <w:r>
         <w:t xml:space="preserve"> </w:t>
@@ -1013,7 +989,7 @@
           <wp:inline>
             <wp:extent cx="5334000" cy="3115204"/>
             <wp:effectExtent b="0" l="0" r="0" t="0"/>
-            <wp:docPr descr="MakerBot scoping a project across machines" title="" id="20" name="Picture"/>
+            <wp:docPr descr="The MakerLab Assistant scoping a project across machines" title="" id="20" name="Picture"/>
             <a:graphic>
               <a:graphicData uri="http://schemas.openxmlformats.org/drawingml/2006/picture">
                 <pic:pic>
@@ -1056,7 +1032,7 @@
         <w:pStyle w:val="ImageCaption"/>
       </w:pPr>
       <w:r>
-        <w:t xml:space="preserve">Fig. 3: Project scoping. From a one-line goal, MakerBot drafts a beginner,</w:t>
+        <w:t xml:space="preserve">Fig. 3: Project scoping. From a one-line goal, the MakerLab Assistant drafts a beginner,</w:t>
       </w:r>
       <w:r>
         <w:t xml:space="preserve"> </w:t>

</xml_diff>